<commit_message>
FarmacogeneticReport.py now works on the template. HLA-B*1502 was added back in.
</commit_message>
<xml_diff>
--- a/Input/Templates/Farmacogenetisch-2024-12.docx
+++ b/Input/Templates/Farmacogenetisch-2024-12.docx
@@ -892,7 +892,7 @@
           </mc:Choice>
           <mc:Fallback>
             <w:pict>
-              <v:group w14:anchorId="57CE1E78" id="Group 4" o:spid="_x0000_s1026" style="position:absolute;margin-left:0;margin-top:3.85pt;width:595.25pt;height:70pt;z-index:-251657728;mso-wrap-distance-left:0;mso-wrap-distance-right:0;mso-position-horizontal-relative:page;mso-height-relative:margin" coordsize="75603,8890" o:gfxdata="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">
+              <v:group w14:anchorId="54BE6A55" id="Group 4" o:spid="_x0000_s1026" style="position:absolute;margin-left:0;margin-top:3.85pt;width:595.25pt;height:70pt;z-index:-251657728;mso-wrap-distance-left:0;mso-wrap-distance-right:0;mso-position-horizontal-relative:page;mso-height-relative:margin" coordsize="75603,8890" o:gfxdata="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">
                 <v:shape id="Graphic 5" o:spid="_x0000_s1027" style="position:absolute;width:75603;height:8890;visibility:visible;mso-wrap-style:square;v-text-anchor:top" coordsize="7560309,889000" o:gfxdata="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" path="m7559992,l,,,888987r7559992,l7559992,xe" fillcolor="#e1ecea" stroked="f">
                   <v:path arrowok="t"/>
                 </v:shape>
@@ -968,6 +968,20 @@
                 <w:rFonts w:ascii="Arboria-Bold" w:hAnsi="Arboria-Bold"/>
               </w:rPr>
             </w:pPr>
+            <w:r>
+              <w:rPr>
+                <w:rFonts w:ascii="Arboria-Bold" w:hAnsi="Arboria-Bold"/>
+              </w:rPr>
+              <w:t xml:space="preserve">S.A. </w:t>
+            </w:r>
+            <w:proofErr w:type="spellStart"/>
+            <w:r>
+              <w:rPr>
+                <w:rFonts w:ascii="Arboria-Bold" w:hAnsi="Arboria-Bold"/>
+              </w:rPr>
+              <w:t>Mple_name</w:t>
+            </w:r>
+            <w:proofErr w:type="spellEnd"/>
           </w:p>
         </w:tc>
         <w:tc>
@@ -1038,12 +1052,14 @@
                 <w:rFonts w:ascii="Arboria-Bold" w:hAnsi="Arboria-Bold"/>
               </w:rPr>
             </w:pPr>
+            <w:proofErr w:type="spellStart"/>
             <w:r>
               <w:rPr>
                 <w:rFonts w:ascii="Arboria-Bold" w:hAnsi="Arboria-Bold"/>
               </w:rPr>
-              <w:t>D402007253</w:t>
-            </w:r>
+              <w:t>Sample_code</w:t>
+            </w:r>
+            <w:proofErr w:type="spellEnd"/>
           </w:p>
         </w:tc>
       </w:tr>
@@ -1164,7 +1180,7 @@
           </mc:Choice>
           <mc:Fallback>
             <w:pict>
-              <v:shape w14:anchorId="7EA803D1" id="Graphic 10" o:spid="_x0000_s1026" style="position:absolute;margin-left:0;margin-top:15.5pt;width:68.05pt;height:.5pt;z-index:-15728640;visibility:visible;mso-wrap-style:square;mso-wrap-distance-left:0;mso-wrap-distance-top:0;mso-wrap-distance-right:0;mso-wrap-distance-bottom:0;mso-position-horizontal:absolute;mso-position-horizontal-relative:page;mso-position-vertical:absolute;mso-position-vertical-relative:text;v-text-anchor:top" coordsize="864235,6350" o:gfxdata="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" path="m863993,l,,,6350r863993,l863993,xe" fillcolor="#2ca499" stroked="f">
+              <v:shape w14:anchorId="6CFAE0B7" id="Graphic 10" o:spid="_x0000_s1026" style="position:absolute;margin-left:0;margin-top:15.5pt;width:68.05pt;height:.5pt;z-index:-15728640;visibility:visible;mso-wrap-style:square;mso-wrap-distance-left:0;mso-wrap-distance-top:0;mso-wrap-distance-right:0;mso-wrap-distance-bottom:0;mso-position-horizontal:absolute;mso-position-horizontal-relative:page;mso-position-vertical:absolute;mso-position-vertical-relative:text;v-text-anchor:top" coordsize="864235,6350" o:gfxdata="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" path="m863993,l,,,6350r863993,l863993,xe" fillcolor="#2ca499" stroked="f">
                 <v:path arrowok="t"/>
                 <w10:wrap type="topAndBottom" anchorx="page"/>
               </v:shape>
@@ -3595,7 +3611,7 @@
           </mc:Choice>
           <mc:Fallback>
             <w:pict>
-              <v:group w14:anchorId="01243DD2" id="Group 18" o:spid="_x0000_s1026" style="position:absolute;margin-left:2.45pt;margin-top:23.1pt;width:80.25pt;height:55.3pt;z-index:-15728128;mso-wrap-distance-left:0;mso-wrap-distance-right:0;mso-position-horizontal-relative:page" coordsize="10191,7023" o:gfxdata="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">
+              <v:group w14:anchorId="0688F4A0" id="Group 18" o:spid="_x0000_s1026" style="position:absolute;margin-left:2.45pt;margin-top:23.1pt;width:80.25pt;height:55.3pt;z-index:-15728128;mso-wrap-distance-left:0;mso-wrap-distance-right:0;mso-position-horizontal-relative:page" coordsize="10191,7023" o:gfxdata="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">
                 <v:shapetype id="_x0000_t75" coordsize="21600,21600" o:spt="75" o:preferrelative="t" path="m@4@5l@4@11@9@11@9@5xe" filled="f" stroked="f">
                   <v:stroke joinstyle="miter"/>
                   <v:formulas>
@@ -3795,7 +3811,7 @@
           </mc:Choice>
           <mc:Fallback>
             <w:pict>
-              <v:shape w14:anchorId="58E4E853" id="Graphic 21" o:spid="_x0000_s1026" style="position:absolute;margin-left:86.3pt;margin-top:21pt;width:6.55pt;height:58.9pt;z-index:-15727616;visibility:visible;mso-wrap-style:square;mso-wrap-distance-left:0;mso-wrap-distance-top:0;mso-wrap-distance-right:0;mso-wrap-distance-bottom:0;mso-position-horizontal:absolute;mso-position-horizontal-relative:page;mso-position-vertical:absolute;mso-position-vertical-relative:text;v-text-anchor:top" coordsize="83185,748030" o:gfxdata="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" path="m42011,l26079,3154,13068,11755,4296,24511,1079,40131,3813,54578r7521,12114l22617,75470r14022,4438l36639,668007r-14410,4202l10599,680967,2829,693221,,707910r3216,15618l11988,736280r13011,8597l40932,748029r15932,-3152l69875,736280r8772,-12752l81864,707910,79225,693700,71953,681724,61016,672933,47383,668273r,-588365l61405,75470,72688,66692,80209,54578,82943,40131,79727,24511,70954,11755,57944,3154,42011,xe" fillcolor="#d6e6e4" stroked="f">
+              <v:shape w14:anchorId="16AA1896" id="Graphic 21" o:spid="_x0000_s1026" style="position:absolute;margin-left:86.3pt;margin-top:21pt;width:6.55pt;height:58.9pt;z-index:-15727616;visibility:visible;mso-wrap-style:square;mso-wrap-distance-left:0;mso-wrap-distance-top:0;mso-wrap-distance-right:0;mso-wrap-distance-bottom:0;mso-position-horizontal:absolute;mso-position-horizontal-relative:page;mso-position-vertical:absolute;mso-position-vertical-relative:text;v-text-anchor:top" coordsize="83185,748030" o:gfxdata="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" path="m42011,l26079,3154,13068,11755,4296,24511,1079,40131,3813,54578r7521,12114l22617,75470r14022,4438l36639,668007r-14410,4202l10599,680967,2829,693221,,707910r3216,15618l11988,736280r13011,8597l40932,748029r15932,-3152l69875,736280r8772,-12752l81864,707910,79225,693700,71953,681724,61016,672933,47383,668273r,-588365l61405,75470,72688,66692,80209,54578,82943,40131,79727,24511,70954,11755,57944,3154,42011,xe" fillcolor="#d6e6e4" stroked="f">
                 <v:path arrowok="t"/>
                 <w10:wrap type="topAndBottom" anchorx="page"/>
               </v:shape>
@@ -4760,7 +4776,7 @@
           </mc:Choice>
           <mc:Fallback>
             <w:pict>
-              <v:group w14:anchorId="0B73D314" id="Group 22" o:spid="_x0000_s1026" style="position:absolute;margin-left:96.45pt;margin-top:22.55pt;width:90.35pt;height:55.85pt;z-index:-15727104;mso-wrap-distance-left:0;mso-wrap-distance-right:0;mso-position-horizontal-relative:page" coordsize="11474,7092" o:gfxdata="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">
+              <v:group w14:anchorId="28FACBD4" id="Group 22" o:spid="_x0000_s1026" style="position:absolute;margin-left:96.45pt;margin-top:22.55pt;width:90.35pt;height:55.85pt;z-index:-15727104;mso-wrap-distance-left:0;mso-wrap-distance-right:0;mso-position-horizontal-relative:page" coordsize="11474,7092" o:gfxdata="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">
                 <v:shape id="Image 23" o:spid="_x0000_s1027" type="#_x0000_t75" style="position:absolute;left:5122;top:2945;width:1224;height:1201;visibility:visible;mso-wrap-style:square" o:gfxdata="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">
                   <v:imagedata r:id="rId8" o:title=""/>
                 </v:shape>
@@ -4947,7 +4963,7 @@
           </mc:Choice>
           <mc:Fallback>
             <w:pict>
-              <v:shape w14:anchorId="6E62F5B6" id="Graphic 25" o:spid="_x0000_s1026" style="position:absolute;margin-left:190.4pt;margin-top:21pt;width:6.6pt;height:58.9pt;z-index:-15726592;visibility:visible;mso-wrap-style:square;mso-wrap-distance-left:0;mso-wrap-distance-top:0;mso-wrap-distance-right:0;mso-wrap-distance-bottom:0;mso-position-horizontal:absolute;mso-position-horizontal-relative:page;mso-position-vertical:absolute;mso-position-vertical-relative:text;v-text-anchor:top" coordsize="83820,748030" o:gfxdata="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" path="m83527,40132l80314,24523,71539,11760,58534,3162,41973,,40754,50,25273,3517,12661,12179,4178,24790,1079,40132,3721,54343r7277,11976l21945,75107r13627,4649l35572,668134r-14021,4445l10261,681355,2743,693470,,707910r3200,15583l11938,736231r12954,8611l40754,748030r,-153l55448,743851r11874,-8737l75260,722769r2895,-14859l75704,694194,68922,682523,58674,673735,45821,668680r,-588556l60617,76161,72593,67437,80606,55054,83527,40132xe" fillcolor="#d6e6e4" stroked="f">
+              <v:shape w14:anchorId="756C51EB" id="Graphic 25" o:spid="_x0000_s1026" style="position:absolute;margin-left:190.4pt;margin-top:21pt;width:6.6pt;height:58.9pt;z-index:-15726592;visibility:visible;mso-wrap-style:square;mso-wrap-distance-left:0;mso-wrap-distance-top:0;mso-wrap-distance-right:0;mso-wrap-distance-bottom:0;mso-position-horizontal:absolute;mso-position-horizontal-relative:page;mso-position-vertical:absolute;mso-position-vertical-relative:text;v-text-anchor:top" coordsize="83820,748030" o:gfxdata="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" path="m83527,40132l80314,24523,71539,11760,58534,3162,41973,,40754,50,25273,3517,12661,12179,4178,24790,1079,40132,3721,54343r7277,11976l21945,75107r13627,4649l35572,668134r-14021,4445l10261,681355,2743,693470,,707910r3200,15583l11938,736231r12954,8611l40754,748030r,-153l55448,743851r11874,-8737l75260,722769r2895,-14859l75704,694194,68922,682523,58674,673735,45821,668680r,-588556l60617,76161,72593,67437,80606,55054,83527,40132xe" fillcolor="#d6e6e4" stroked="f">
                 <v:path arrowok="t"/>
                 <w10:wrap type="topAndBottom" anchorx="page"/>
               </v:shape>
@@ -5912,7 +5928,7 @@
           </mc:Choice>
           <mc:Fallback>
             <w:pict>
-              <v:group w14:anchorId="45383758" id="Group 26" o:spid="_x0000_s1026" style="position:absolute;margin-left:200.6pt;margin-top:22.55pt;width:90.35pt;height:55.85pt;z-index:-15726080;mso-wrap-distance-left:0;mso-wrap-distance-right:0;mso-position-horizontal-relative:page" coordsize="11474,7092" o:gfxdata="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">
+              <v:group w14:anchorId="7E1DD8F1" id="Group 26" o:spid="_x0000_s1026" style="position:absolute;margin-left:200.6pt;margin-top:22.55pt;width:90.35pt;height:55.85pt;z-index:-15726080;mso-wrap-distance-left:0;mso-wrap-distance-right:0;mso-position-horizontal-relative:page" coordsize="11474,7092" o:gfxdata="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">
                 <v:shape id="Image 27" o:spid="_x0000_s1027" type="#_x0000_t75" style="position:absolute;left:5122;top:2945;width:1224;height:1201;visibility:visible;mso-wrap-style:square" o:gfxdata="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">
                   <v:imagedata r:id="rId8" o:title=""/>
                 </v:shape>
@@ -6093,7 +6109,7 @@
           </mc:Choice>
           <mc:Fallback>
             <w:pict>
-              <v:shape w14:anchorId="5361BC8F" id="Graphic 29" o:spid="_x0000_s1026" style="position:absolute;margin-left:294.55pt;margin-top:21pt;width:6.55pt;height:58.9pt;z-index:-15725568;visibility:visible;mso-wrap-style:square;mso-wrap-distance-left:0;mso-wrap-distance-top:0;mso-wrap-distance-right:0;mso-wrap-distance-bottom:0;mso-position-horizontal:absolute;mso-position-horizontal-relative:page;mso-position-vertical:absolute;mso-position-vertical-relative:text;v-text-anchor:top" coordsize="83185,748030" o:gfxdata="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" path="m42011,l26079,3154,13068,11755,4296,24511,1079,40131,3813,54578r7521,12114l22617,75470r14022,4438l36639,668007r-14410,4202l10599,680967,2829,693221,,707910r3216,15618l11988,736280r13011,8597l40932,748029r15932,-3152l69875,736280r8772,-12752l81864,707910,79225,693700,71953,681724,61016,672933,47383,668273r,-588365l61405,75470,72688,66692,80209,54578,82943,40131,79727,24511,70954,11755,57944,3154,42011,xe" fillcolor="#d6e6e4" stroked="f">
+              <v:shape w14:anchorId="18175253" id="Graphic 29" o:spid="_x0000_s1026" style="position:absolute;margin-left:294.55pt;margin-top:21pt;width:6.55pt;height:58.9pt;z-index:-15725568;visibility:visible;mso-wrap-style:square;mso-wrap-distance-left:0;mso-wrap-distance-top:0;mso-wrap-distance-right:0;mso-wrap-distance-bottom:0;mso-position-horizontal:absolute;mso-position-horizontal-relative:page;mso-position-vertical:absolute;mso-position-vertical-relative:text;v-text-anchor:top" coordsize="83185,748030" o:gfxdata="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" path="m42011,l26079,3154,13068,11755,4296,24511,1079,40131,3813,54578r7521,12114l22617,75470r14022,4438l36639,668007r-14410,4202l10599,680967,2829,693221,,707910r3216,15618l11988,736280r13011,8597l40932,748029r15932,-3152l69875,736280r8772,-12752l81864,707910,79225,693700,71953,681724,61016,672933,47383,668273r,-588365l61405,75470,72688,66692,80209,54578,82943,40131,79727,24511,70954,11755,57944,3154,42011,xe" fillcolor="#d6e6e4" stroked="f">
                 <v:path arrowok="t"/>
                 <w10:wrap type="topAndBottom" anchorx="page"/>
               </v:shape>
@@ -7058,7 +7074,7 @@
           </mc:Choice>
           <mc:Fallback>
             <w:pict>
-              <v:group w14:anchorId="1EA06366" id="Group 30" o:spid="_x0000_s1026" style="position:absolute;margin-left:304.7pt;margin-top:22.55pt;width:90.35pt;height:55.85pt;z-index:-15725056;mso-wrap-distance-left:0;mso-wrap-distance-right:0;mso-position-horizontal-relative:page" coordsize="11474,7092" o:gfxdata="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">
+              <v:group w14:anchorId="2DBCDC23" id="Group 30" o:spid="_x0000_s1026" style="position:absolute;margin-left:304.7pt;margin-top:22.55pt;width:90.35pt;height:55.85pt;z-index:-15725056;mso-wrap-distance-left:0;mso-wrap-distance-right:0;mso-position-horizontal-relative:page" coordsize="11474,7092" o:gfxdata="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">
                 <v:shape id="Image 31" o:spid="_x0000_s1027" type="#_x0000_t75" style="position:absolute;left:5122;top:2945;width:1224;height:1201;visibility:visible;mso-wrap-style:square" o:gfxdata="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">
                   <v:imagedata r:id="rId6" o:title=""/>
                 </v:shape>
@@ -7266,7 +7282,7 @@
           </mc:Choice>
           <mc:Fallback>
             <w:pict>
-              <v:shape w14:anchorId="44391A4C" id="Graphic 33" o:spid="_x0000_s1026" style="position:absolute;margin-left:398.65pt;margin-top:21pt;width:6.4pt;height:58.9pt;z-index:-15724544;visibility:visible;mso-wrap-style:square;mso-wrap-distance-left:0;mso-wrap-distance-top:0;mso-wrap-distance-right:0;mso-wrap-distance-bottom:0;mso-position-horizontal:absolute;mso-position-horizontal-relative:page;mso-position-vertical:absolute;mso-position-vertical-relative:text;v-text-anchor:top" coordsize="81280,748030" o:gfxdata="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" path="m80987,40132l77774,24523,68999,11760,55994,3162,40754,254r,-216l40233,165,39433,,38214,50r,559l25260,3517,12649,12179,4178,24790,1079,40132,3721,54343r7264,11976l21932,75107r13640,4649l35572,668134r-14033,4445l10261,681355,2730,693470,,707910r3200,15583l11925,736231r12954,8611l38214,747522r,355l38963,747674r1791,356l40754,747191r12141,-3340l64770,735114r7950,-12345l75615,707910,73164,694194,66382,682523,56134,673735,43281,668680r,-588556l58077,76161,70040,67437,78066,55054,80987,40132xe" fillcolor="#d6e6e4" stroked="f">
+              <v:shape w14:anchorId="39447B6F" id="Graphic 33" o:spid="_x0000_s1026" style="position:absolute;margin-left:398.65pt;margin-top:21pt;width:6.4pt;height:58.9pt;z-index:-15724544;visibility:visible;mso-wrap-style:square;mso-wrap-distance-left:0;mso-wrap-distance-top:0;mso-wrap-distance-right:0;mso-wrap-distance-bottom:0;mso-position-horizontal:absolute;mso-position-horizontal-relative:page;mso-position-vertical:absolute;mso-position-vertical-relative:text;v-text-anchor:top" coordsize="81280,748030" o:gfxdata="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" path="m80987,40132l77774,24523,68999,11760,55994,3162,40754,254r,-216l40233,165,39433,,38214,50r,559l25260,3517,12649,12179,4178,24790,1079,40132,3721,54343r7264,11976l21932,75107r13640,4649l35572,668134r-14033,4445l10261,681355,2730,693470,,707910r3200,15583l11925,736231r12954,8611l38214,747522r,355l38963,747674r1791,356l40754,747191r12141,-3340l64770,735114r7950,-12345l75615,707910,73164,694194,66382,682523,56134,673735,43281,668680r,-588556l58077,76161,70040,67437,78066,55054,80987,40132xe" fillcolor="#d6e6e4" stroked="f">
                 <v:path arrowok="t"/>
                 <w10:wrap type="topAndBottom" anchorx="page"/>
               </v:shape>
@@ -8231,7 +8247,7 @@
           </mc:Choice>
           <mc:Fallback>
             <w:pict>
-              <v:group w14:anchorId="39FB5066" id="Group 34" o:spid="_x0000_s1026" style="position:absolute;margin-left:408.65pt;margin-top:22.55pt;width:90.35pt;height:55.85pt;z-index:-15724032;mso-wrap-distance-left:0;mso-wrap-distance-right:0;mso-position-horizontal-relative:page" coordsize="11474,7092" o:gfxdata="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">
+              <v:group w14:anchorId="68F9C658" id="Group 34" o:spid="_x0000_s1026" style="position:absolute;margin-left:408.65pt;margin-top:22.55pt;width:90.35pt;height:55.85pt;z-index:-15724032;mso-wrap-distance-left:0;mso-wrap-distance-right:0;mso-position-horizontal-relative:page" coordsize="11474,7092" o:gfxdata="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">
                 <v:shape id="Image 35" o:spid="_x0000_s1027" type="#_x0000_t75" style="position:absolute;left:5122;top:2945;width:1224;height:1201;visibility:visible;mso-wrap-style:square" o:gfxdata="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">
                   <v:imagedata r:id="rId6" o:title=""/>
                 </v:shape>
@@ -8412,7 +8428,7 @@
           </mc:Choice>
           <mc:Fallback>
             <w:pict>
-              <v:shape w14:anchorId="6D052F87" id="Graphic 37" o:spid="_x0000_s1026" style="position:absolute;margin-left:502.6pt;margin-top:21pt;width:6.55pt;height:58.9pt;z-index:-15723520;visibility:visible;mso-wrap-style:square;mso-wrap-distance-left:0;mso-wrap-distance-top:0;mso-wrap-distance-right:0;mso-wrap-distance-bottom:0;mso-position-horizontal:absolute;mso-position-horizontal-relative:page;mso-position-vertical:absolute;mso-position-vertical-relative:text;v-text-anchor:top" coordsize="83185,748030" o:gfxdata="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" path="m42011,l26079,3154,13068,11755,4296,24511,1079,40131,3813,54578r7521,12114l22617,75470r14022,4438l36639,668007r-14410,4202l10599,680967,2829,693221,,707910r3216,15618l11988,736280r13011,8597l40932,748029r15932,-3152l69875,736280r8772,-12752l81864,707910,79225,693700,71953,681724,61016,672933,47383,668273r,-588365l61405,75470,72688,66692,80209,54578,82943,40131,79727,24511,70954,11755,57944,3154,42011,xe" fillcolor="#d6e6e4" stroked="f">
+              <v:shape w14:anchorId="4F2BDB3E" id="Graphic 37" o:spid="_x0000_s1026" style="position:absolute;margin-left:502.6pt;margin-top:21pt;width:6.55pt;height:58.9pt;z-index:-15723520;visibility:visible;mso-wrap-style:square;mso-wrap-distance-left:0;mso-wrap-distance-top:0;mso-wrap-distance-right:0;mso-wrap-distance-bottom:0;mso-position-horizontal:absolute;mso-position-horizontal-relative:page;mso-position-vertical:absolute;mso-position-vertical-relative:text;v-text-anchor:top" coordsize="83185,748030" o:gfxdata="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" path="m42011,l26079,3154,13068,11755,4296,24511,1079,40131,3813,54578r7521,12114l22617,75470r14022,4438l36639,668007r-14410,4202l10599,680967,2829,693221,,707910r3216,15618l11988,736280r13011,8597l40932,748029r15932,-3152l69875,736280r8772,-12752l81864,707910,79225,693700,71953,681724,61016,672933,47383,668273r,-588365l61405,75470,72688,66692,80209,54578,82943,40131,79727,24511,70954,11755,57944,3154,42011,xe" fillcolor="#d6e6e4" stroked="f">
                 <v:path arrowok="t"/>
                 <w10:wrap type="topAndBottom" anchorx="page"/>
               </v:shape>
@@ -9269,7 +9285,7 @@
           </mc:Choice>
           <mc:Fallback>
             <w:pict>
-              <v:group w14:anchorId="0C11CFBF" id="Group 38" o:spid="_x0000_s1026" style="position:absolute;margin-left:512.8pt;margin-top:22.55pt;width:80.25pt;height:55.3pt;z-index:-15723008;mso-wrap-distance-left:0;mso-wrap-distance-right:0;mso-position-horizontal-relative:page" coordsize="10191,7023" o:gfxdata="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">
+              <v:group w14:anchorId="393CCC54" id="Group 38" o:spid="_x0000_s1026" style="position:absolute;margin-left:512.8pt;margin-top:22.55pt;width:80.25pt;height:55.3pt;z-index:-15723008;mso-wrap-distance-left:0;mso-wrap-distance-right:0;mso-position-horizontal-relative:page" coordsize="10191,7023" o:gfxdata="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">
                 <v:shape id="Image 39" o:spid="_x0000_s1027" type="#_x0000_t75" style="position:absolute;left:5122;top:2945;width:1224;height:1201;visibility:visible;mso-wrap-style:square" o:gfxdata="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">
                   <v:imagedata r:id="rId6" o:title=""/>
                 </v:shape>
@@ -9393,7 +9409,7 @@
           </mc:Choice>
           <mc:Fallback>
             <w:pict>
-              <v:group w14:anchorId="490B3DD9" id="Group 41" o:spid="_x0000_s1026" style="width:73.75pt;height:.5pt;mso-position-horizontal-relative:char;mso-position-vertical-relative:line" coordsize="9366,63" o:gfxdata="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">
+              <v:group w14:anchorId="50C81C5D" id="Group 41" o:spid="_x0000_s1026" style="width:73.75pt;height:.5pt;mso-position-horizontal-relative:char;mso-position-vertical-relative:line" coordsize="9366,63" o:gfxdata="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">
                 <v:shape id="Graphic 42" o:spid="_x0000_s1027" style="position:absolute;width:9366;height:63;visibility:visible;mso-wrap-style:square;v-text-anchor:top" coordsize="936625,6350" o:gfxdata="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" path="m936002,l,,,6350r936002,l936002,xe" fillcolor="#2ca499" stroked="f">
                   <v:path arrowok="t"/>
                 </v:shape>
@@ -12662,7 +12678,6 @@
               <w:spacing w:before="0"/>
               <w:ind w:left="0"/>
               <w:rPr>
-                <w:rFonts w:ascii="Times New Roman"/>
                 <w:sz w:val="18"/>
               </w:rPr>
             </w:pPr>
@@ -12679,7 +12694,6 @@
               <w:spacing w:before="0"/>
               <w:ind w:left="0"/>
               <w:rPr>
-                <w:rFonts w:ascii="Times New Roman"/>
                 <w:sz w:val="18"/>
               </w:rPr>
             </w:pPr>
@@ -12724,7 +12738,6 @@
               <w:spacing w:before="0"/>
               <w:ind w:left="0"/>
               <w:rPr>
-                <w:rFonts w:ascii="Times New Roman"/>
                 <w:sz w:val="18"/>
               </w:rPr>
             </w:pPr>
@@ -12741,7 +12754,6 @@
               <w:spacing w:before="0"/>
               <w:ind w:left="0"/>
               <w:rPr>
-                <w:rFonts w:ascii="Times New Roman"/>
                 <w:sz w:val="18"/>
               </w:rPr>
             </w:pPr>
@@ -12786,7 +12798,6 @@
               <w:spacing w:before="0"/>
               <w:ind w:left="0"/>
               <w:rPr>
-                <w:rFonts w:ascii="Times New Roman"/>
                 <w:sz w:val="18"/>
               </w:rPr>
             </w:pPr>
@@ -12803,7 +12814,6 @@
               <w:spacing w:before="0"/>
               <w:ind w:left="0"/>
               <w:rPr>
-                <w:rFonts w:ascii="Times New Roman"/>
                 <w:sz w:val="18"/>
               </w:rPr>
             </w:pPr>
@@ -12848,7 +12858,6 @@
               <w:spacing w:before="0"/>
               <w:ind w:left="0"/>
               <w:rPr>
-                <w:rFonts w:ascii="Times New Roman"/>
                 <w:sz w:val="18"/>
               </w:rPr>
             </w:pPr>
@@ -12865,7 +12874,6 @@
               <w:spacing w:before="0"/>
               <w:ind w:left="0"/>
               <w:rPr>
-                <w:rFonts w:ascii="Times New Roman"/>
                 <w:sz w:val="18"/>
               </w:rPr>
             </w:pPr>
@@ -12910,7 +12918,6 @@
               <w:spacing w:before="0"/>
               <w:ind w:left="0"/>
               <w:rPr>
-                <w:rFonts w:ascii="Times New Roman"/>
                 <w:sz w:val="18"/>
               </w:rPr>
             </w:pPr>
@@ -12927,7 +12934,6 @@
               <w:spacing w:before="0"/>
               <w:ind w:left="0"/>
               <w:rPr>
-                <w:rFonts w:ascii="Times New Roman"/>
                 <w:sz w:val="18"/>
               </w:rPr>
             </w:pPr>
@@ -12972,7 +12978,6 @@
               <w:spacing w:before="0"/>
               <w:ind w:left="0"/>
               <w:rPr>
-                <w:rFonts w:ascii="Times New Roman"/>
                 <w:sz w:val="18"/>
               </w:rPr>
             </w:pPr>
@@ -12989,7 +12994,6 @@
               <w:spacing w:before="0"/>
               <w:ind w:left="0"/>
               <w:rPr>
-                <w:rFonts w:ascii="Times New Roman"/>
                 <w:sz w:val="18"/>
               </w:rPr>
             </w:pPr>
@@ -13034,7 +13038,6 @@
               <w:spacing w:before="0"/>
               <w:ind w:left="0"/>
               <w:rPr>
-                <w:rFonts w:ascii="Times New Roman"/>
                 <w:sz w:val="18"/>
               </w:rPr>
             </w:pPr>
@@ -13051,7 +13054,6 @@
               <w:spacing w:before="0"/>
               <w:ind w:left="0"/>
               <w:rPr>
-                <w:rFonts w:ascii="Times New Roman"/>
                 <w:sz w:val="18"/>
               </w:rPr>
             </w:pPr>
@@ -13096,7 +13098,6 @@
               <w:spacing w:before="0"/>
               <w:ind w:left="0"/>
               <w:rPr>
-                <w:rFonts w:ascii="Times New Roman"/>
                 <w:sz w:val="18"/>
               </w:rPr>
             </w:pPr>
@@ -13113,7 +13114,6 @@
               <w:spacing w:before="0"/>
               <w:ind w:left="0"/>
               <w:rPr>
-                <w:rFonts w:ascii="Times New Roman"/>
                 <w:sz w:val="18"/>
               </w:rPr>
             </w:pPr>
@@ -13158,7 +13158,6 @@
               <w:spacing w:before="0"/>
               <w:ind w:left="0"/>
               <w:rPr>
-                <w:rFonts w:ascii="Times New Roman"/>
                 <w:sz w:val="18"/>
               </w:rPr>
             </w:pPr>
@@ -13175,7 +13174,6 @@
               <w:spacing w:before="0"/>
               <w:ind w:left="0"/>
               <w:rPr>
-                <w:rFonts w:ascii="Times New Roman"/>
                 <w:sz w:val="18"/>
               </w:rPr>
             </w:pPr>
@@ -13220,7 +13218,6 @@
               <w:spacing w:before="0"/>
               <w:ind w:left="0"/>
               <w:rPr>
-                <w:rFonts w:ascii="Times New Roman"/>
                 <w:sz w:val="18"/>
               </w:rPr>
             </w:pPr>
@@ -13237,7 +13234,6 @@
               <w:spacing w:before="0"/>
               <w:ind w:left="0"/>
               <w:rPr>
-                <w:rFonts w:ascii="Times New Roman"/>
                 <w:sz w:val="18"/>
               </w:rPr>
             </w:pPr>
@@ -13282,7 +13278,6 @@
               <w:spacing w:before="0"/>
               <w:ind w:left="0"/>
               <w:rPr>
-                <w:rFonts w:ascii="Times New Roman"/>
                 <w:sz w:val="18"/>
               </w:rPr>
             </w:pPr>
@@ -13299,7 +13294,6 @@
               <w:spacing w:before="0"/>
               <w:ind w:left="0"/>
               <w:rPr>
-                <w:rFonts w:ascii="Times New Roman"/>
                 <w:sz w:val="18"/>
               </w:rPr>
             </w:pPr>
@@ -13351,7 +13345,6 @@
               <w:spacing w:before="0"/>
               <w:ind w:left="0"/>
               <w:rPr>
-                <w:rFonts w:ascii="Times New Roman"/>
                 <w:sz w:val="18"/>
               </w:rPr>
             </w:pPr>
@@ -13368,7 +13361,6 @@
               <w:spacing w:before="0"/>
               <w:ind w:left="0"/>
               <w:rPr>
-                <w:rFonts w:ascii="Times New Roman"/>
                 <w:sz w:val="18"/>
               </w:rPr>
             </w:pPr>
@@ -13413,7 +13405,6 @@
               <w:spacing w:before="0"/>
               <w:ind w:left="0"/>
               <w:rPr>
-                <w:rFonts w:ascii="Times New Roman"/>
                 <w:sz w:val="18"/>
               </w:rPr>
             </w:pPr>
@@ -13430,7 +13421,6 @@
               <w:spacing w:before="0"/>
               <w:ind w:left="0"/>
               <w:rPr>
-                <w:rFonts w:ascii="Times New Roman"/>
                 <w:sz w:val="18"/>
               </w:rPr>
             </w:pPr>
@@ -13476,7 +13466,6 @@
               <w:spacing w:before="0"/>
               <w:ind w:left="0"/>
               <w:rPr>
-                <w:rFonts w:ascii="Times New Roman"/>
                 <w:sz w:val="18"/>
               </w:rPr>
             </w:pPr>
@@ -13493,7 +13482,6 @@
               <w:spacing w:before="0"/>
               <w:ind w:left="0"/>
               <w:rPr>
-                <w:rFonts w:ascii="Times New Roman"/>
                 <w:sz w:val="18"/>
               </w:rPr>
             </w:pPr>
@@ -13539,7 +13527,6 @@
               <w:spacing w:before="0"/>
               <w:ind w:left="0"/>
               <w:rPr>
-                <w:rFonts w:ascii="Times New Roman"/>
                 <w:sz w:val="18"/>
               </w:rPr>
             </w:pPr>
@@ -13556,7 +13543,6 @@
               <w:spacing w:before="0"/>
               <w:ind w:left="0"/>
               <w:rPr>
-                <w:rFonts w:ascii="Times New Roman"/>
                 <w:sz w:val="18"/>
               </w:rPr>
             </w:pPr>
@@ -13602,7 +13588,6 @@
               <w:spacing w:before="0"/>
               <w:ind w:left="0"/>
               <w:rPr>
-                <w:rFonts w:ascii="Times New Roman"/>
                 <w:sz w:val="18"/>
               </w:rPr>
             </w:pPr>
@@ -13619,7 +13604,6 @@
               <w:spacing w:before="0"/>
               <w:ind w:left="0"/>
               <w:rPr>
-                <w:rFonts w:ascii="Times New Roman"/>
                 <w:sz w:val="18"/>
               </w:rPr>
             </w:pPr>
@@ -13665,7 +13649,6 @@
               <w:spacing w:before="0"/>
               <w:ind w:left="0"/>
               <w:rPr>
-                <w:rFonts w:ascii="Times New Roman"/>
                 <w:sz w:val="18"/>
               </w:rPr>
             </w:pPr>
@@ -13682,7 +13665,6 @@
               <w:spacing w:before="0"/>
               <w:ind w:left="0"/>
               <w:rPr>
-                <w:rFonts w:ascii="Times New Roman"/>
                 <w:sz w:val="18"/>
               </w:rPr>
             </w:pPr>
@@ -13728,7 +13710,6 @@
               <w:spacing w:before="0"/>
               <w:ind w:left="0"/>
               <w:rPr>
-                <w:rFonts w:ascii="Times New Roman"/>
                 <w:sz w:val="18"/>
               </w:rPr>
             </w:pPr>
@@ -13745,7 +13726,6 @@
               <w:spacing w:before="0"/>
               <w:ind w:left="0"/>
               <w:rPr>
-                <w:rFonts w:ascii="Times New Roman"/>
                 <w:sz w:val="18"/>
               </w:rPr>
             </w:pPr>
@@ -13856,7 +13836,7 @@
           </mc:Choice>
           <mc:Fallback>
             <w:pict>
-              <v:shape w14:anchorId="041917A3" id="Graphic 49" o:spid="_x0000_s1026" style="position:absolute;margin-left:0;margin-top:21.9pt;width:73.75pt;height:.5pt;z-index:-15720448;visibility:visible;mso-wrap-style:square;mso-wrap-distance-left:0;mso-wrap-distance-top:0;mso-wrap-distance-right:0;mso-wrap-distance-bottom:0;mso-position-horizontal:absolute;mso-position-horizontal-relative:page;mso-position-vertical:absolute;mso-position-vertical-relative:text;v-text-anchor:top" coordsize="936625,6350" o:gfxdata="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" path="m936002,l,,,6350r936002,l936002,xe" fillcolor="#2ca499" stroked="f">
+              <v:shape w14:anchorId="6C62F5B5" id="Graphic 49" o:spid="_x0000_s1026" style="position:absolute;margin-left:0;margin-top:21.9pt;width:73.75pt;height:.5pt;z-index:-15720448;visibility:visible;mso-wrap-style:square;mso-wrap-distance-left:0;mso-wrap-distance-top:0;mso-wrap-distance-right:0;mso-wrap-distance-bottom:0;mso-position-horizontal:absolute;mso-position-horizontal-relative:page;mso-position-vertical:absolute;mso-position-vertical-relative:text;v-text-anchor:top" coordsize="936625,6350" o:gfxdata="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" path="m936002,l,,,6350r936002,l936002,xe" fillcolor="#2ca499" stroked="f">
                 <v:path arrowok="t"/>
                 <w10:wrap type="topAndBottom" anchorx="page"/>
               </v:shape>
@@ -14068,7 +14048,7 @@
           </mc:Choice>
           <mc:Fallback>
             <w:pict>
-              <v:group w14:anchorId="039E36C2" id="Group 50" o:spid="_x0000_s1026" style="width:73.75pt;height:.5pt;mso-position-horizontal-relative:char;mso-position-vertical-relative:line" coordsize="9366,63" o:gfxdata="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">
+              <v:group w14:anchorId="36AB6A6E" id="Group 50" o:spid="_x0000_s1026" style="width:73.75pt;height:.5pt;mso-position-horizontal-relative:char;mso-position-vertical-relative:line" coordsize="9366,63" o:gfxdata="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">
                 <v:shape id="Graphic 51" o:spid="_x0000_s1027" style="position:absolute;width:9366;height:63;visibility:visible;mso-wrap-style:square;v-text-anchor:top" coordsize="936625,6350" o:gfxdata="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" path="m936002,l,,,6350r936002,l936002,xe" fillcolor="#2ca499" stroked="f">
                   <v:path arrowok="t"/>
                 </v:shape>
@@ -21887,7 +21867,7 @@
           </mc:Choice>
           <mc:Fallback>
             <w:pict>
-              <v:group w14:anchorId="3F7E4C1F" id="Group 52" o:spid="_x0000_s1026" style="width:73.75pt;height:.5pt;mso-position-horizontal-relative:char;mso-position-vertical-relative:line" coordsize="9366,63" o:gfxdata="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">
+              <v:group w14:anchorId="611F49E1" id="Group 52" o:spid="_x0000_s1026" style="width:73.75pt;height:.5pt;mso-position-horizontal-relative:char;mso-position-vertical-relative:line" coordsize="9366,63" o:gfxdata="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">
                 <v:shape id="Graphic 53" o:spid="_x0000_s1027" style="position:absolute;width:9366;height:63;visibility:visible;mso-wrap-style:square;v-text-anchor:top" coordsize="936625,6350" o:gfxdata="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" path="m936002,l,,,6350r936002,l936002,xe" fillcolor="#2ca499" stroked="f">
                   <v:path arrowok="t"/>
                 </v:shape>
@@ -24077,7 +24057,7 @@
           </mc:Choice>
           <mc:Fallback>
             <w:pict>
-              <v:group w14:anchorId="3EFD85DA" id="Group 54" o:spid="_x0000_s1026" style="position:absolute;margin-left:2.45pt;margin-top:24.5pt;width:80.25pt;height:55.3pt;z-index:-15718400;mso-wrap-distance-left:0;mso-wrap-distance-right:0;mso-position-horizontal-relative:page" coordsize="10191,7023" o:gfxdata="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">
+              <v:group w14:anchorId="4AACC1D4" id="Group 54" o:spid="_x0000_s1026" style="position:absolute;margin-left:2.45pt;margin-top:24.5pt;width:80.25pt;height:55.3pt;z-index:-15718400;mso-wrap-distance-left:0;mso-wrap-distance-right:0;mso-position-horizontal-relative:page" coordsize="10191,7023" o:gfxdata="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">
                 <v:shape id="Image 55" o:spid="_x0000_s1027" type="#_x0000_t75" style="position:absolute;left:3841;top:2870;width:1225;height:1201;visibility:visible;mso-wrap-style:square" o:gfxdata="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">
                   <v:imagedata r:id="rId14" o:title=""/>
                 </v:shape>
@@ -24258,7 +24238,7 @@
           </mc:Choice>
           <mc:Fallback>
             <w:pict>
-              <v:shape w14:anchorId="297F57D3" id="Graphic 57" o:spid="_x0000_s1026" style="position:absolute;margin-left:86.3pt;margin-top:22.35pt;width:6.55pt;height:58.9pt;z-index:-15717888;visibility:visible;mso-wrap-style:square;mso-wrap-distance-left:0;mso-wrap-distance-top:0;mso-wrap-distance-right:0;mso-wrap-distance-bottom:0;mso-position-horizontal:absolute;mso-position-horizontal-relative:page;mso-position-vertical:absolute;mso-position-vertical-relative:text;v-text-anchor:top" coordsize="83185,748030" o:gfxdata="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" path="m42011,l26079,3154,13068,11755,4296,24511,1079,40132,3813,54578r7521,12114l22617,75470r14022,4438l36639,668007r-14410,4202l10599,680967,2829,693221,,707910r3216,15618l11988,736280r13011,8597l40932,748030r15932,-3153l69875,736280r8772,-12752l81864,707910,79225,693700,71953,681724,61016,672933,47383,668274r,-588366l61405,75470,72688,66692,80209,54578,82943,40132,79727,24511,70954,11755,57944,3154,42011,xe" fillcolor="#9ecac5" stroked="f">
+              <v:shape w14:anchorId="5F82CA73" id="Graphic 57" o:spid="_x0000_s1026" style="position:absolute;margin-left:86.3pt;margin-top:22.35pt;width:6.55pt;height:58.9pt;z-index:-15717888;visibility:visible;mso-wrap-style:square;mso-wrap-distance-left:0;mso-wrap-distance-top:0;mso-wrap-distance-right:0;mso-wrap-distance-bottom:0;mso-position-horizontal:absolute;mso-position-horizontal-relative:page;mso-position-vertical:absolute;mso-position-vertical-relative:text;v-text-anchor:top" coordsize="83185,748030" o:gfxdata="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" path="m42011,l26079,3154,13068,11755,4296,24511,1079,40132,3813,54578r7521,12114l22617,75470r14022,4438l36639,668007r-14410,4202l10599,680967,2829,693221,,707910r3216,15618l11988,736280r13011,8597l40932,748030r15932,-3153l69875,736280r8772,-12752l81864,707910,79225,693700,71953,681724,61016,672933,47383,668274r,-588366l61405,75470,72688,66692,80209,54578,82943,40132,79727,24511,70954,11755,57944,3154,42011,xe" fillcolor="#9ecac5" stroked="f">
                 <v:path arrowok="t"/>
                 <w10:wrap type="topAndBottom" anchorx="page"/>
               </v:shape>
@@ -25223,7 +25203,7 @@
           </mc:Choice>
           <mc:Fallback>
             <w:pict>
-              <v:group w14:anchorId="3D44812F" id="Group 58" o:spid="_x0000_s1026" style="position:absolute;margin-left:96.45pt;margin-top:23.9pt;width:90.35pt;height:55.85pt;z-index:-15717376;mso-wrap-distance-left:0;mso-wrap-distance-right:0;mso-position-horizontal-relative:page" coordsize="11474,7092" o:gfxdata="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">
+              <v:group w14:anchorId="6AD7E73F" id="Group 58" o:spid="_x0000_s1026" style="position:absolute;margin-left:96.45pt;margin-top:23.9pt;width:90.35pt;height:55.85pt;z-index:-15717376;mso-wrap-distance-left:0;mso-wrap-distance-right:0;mso-position-horizontal-relative:page" coordsize="11474,7092" o:gfxdata="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">
                 <v:shape id="Image 59" o:spid="_x0000_s1027" type="#_x0000_t75" style="position:absolute;left:5122;top:2945;width:1224;height:1201;visibility:visible;mso-wrap-style:square" o:gfxdata="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">
                   <v:imagedata r:id="rId16" o:title=""/>
                 </v:shape>
@@ -25410,7 +25390,7 @@
           </mc:Choice>
           <mc:Fallback>
             <w:pict>
-              <v:shape w14:anchorId="6DD96B40" id="Graphic 61" o:spid="_x0000_s1026" style="position:absolute;margin-left:190.4pt;margin-top:22.35pt;width:6.6pt;height:58.9pt;z-index:-15716864;visibility:visible;mso-wrap-style:square;mso-wrap-distance-left:0;mso-wrap-distance-top:0;mso-wrap-distance-right:0;mso-wrap-distance-bottom:0;mso-position-horizontal:absolute;mso-position-horizontal-relative:page;mso-position-vertical:absolute;mso-position-vertical-relative:text;v-text-anchor:top" coordsize="83820,748030" o:gfxdata="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" path="m83527,40132l80314,24523,71539,11760,58534,3162,41973,,40754,50,25273,3517,12661,12179,4178,24790,1079,40132,3721,54343r7277,11976l21945,75107r13627,4649l35572,668134r-14021,4445l10261,681355,2743,693470,,707910r3200,15583l11938,736231r12954,8611l40754,748030r,-153l55448,743851r11874,-8737l75260,722769r2895,-14859l75704,694194,68922,682523,58674,673735,45821,668680r,-588556l60617,76161,72593,67437,80606,55054,83527,40132xe" fillcolor="#9ecac5" stroked="f">
+              <v:shape w14:anchorId="4E6D182A" id="Graphic 61" o:spid="_x0000_s1026" style="position:absolute;margin-left:190.4pt;margin-top:22.35pt;width:6.6pt;height:58.9pt;z-index:-15716864;visibility:visible;mso-wrap-style:square;mso-wrap-distance-left:0;mso-wrap-distance-top:0;mso-wrap-distance-right:0;mso-wrap-distance-bottom:0;mso-position-horizontal:absolute;mso-position-horizontal-relative:page;mso-position-vertical:absolute;mso-position-vertical-relative:text;v-text-anchor:top" coordsize="83820,748030" o:gfxdata="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" path="m83527,40132l80314,24523,71539,11760,58534,3162,41973,,40754,50,25273,3517,12661,12179,4178,24790,1079,40132,3721,54343r7277,11976l21945,75107r13627,4649l35572,668134r-14021,4445l10261,681355,2743,693470,,707910r3200,15583l11938,736231r12954,8611l40754,748030r,-153l55448,743851r11874,-8737l75260,722769r2895,-14859l75704,694194,68922,682523,58674,673735,45821,668680r,-588556l60617,76161,72593,67437,80606,55054,83527,40132xe" fillcolor="#9ecac5" stroked="f">
                 <v:path arrowok="t"/>
                 <w10:wrap type="topAndBottom" anchorx="page"/>
               </v:shape>
@@ -26375,7 +26355,7 @@
           </mc:Choice>
           <mc:Fallback>
             <w:pict>
-              <v:group w14:anchorId="42E78430" id="Group 62" o:spid="_x0000_s1026" style="position:absolute;margin-left:200.6pt;margin-top:23.9pt;width:90.35pt;height:55.85pt;z-index:-15716352;mso-wrap-distance-left:0;mso-wrap-distance-right:0;mso-position-horizontal-relative:page" coordsize="11474,7092" o:gfxdata="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">
+              <v:group w14:anchorId="423F4E3D" id="Group 62" o:spid="_x0000_s1026" style="position:absolute;margin-left:200.6pt;margin-top:23.9pt;width:90.35pt;height:55.85pt;z-index:-15716352;mso-wrap-distance-left:0;mso-wrap-distance-right:0;mso-position-horizontal-relative:page" coordsize="11474,7092" o:gfxdata="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">
                 <v:shape id="Image 63" o:spid="_x0000_s1027" type="#_x0000_t75" style="position:absolute;left:5122;top:2945;width:1224;height:1201;visibility:visible;mso-wrap-style:square" o:gfxdata="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">
                   <v:imagedata r:id="rId16" o:title=""/>
                 </v:shape>
@@ -26556,7 +26536,7 @@
           </mc:Choice>
           <mc:Fallback>
             <w:pict>
-              <v:shape w14:anchorId="7211DD88" id="Graphic 65" o:spid="_x0000_s1026" style="position:absolute;margin-left:294.55pt;margin-top:22.35pt;width:6.55pt;height:58.9pt;z-index:-15715840;visibility:visible;mso-wrap-style:square;mso-wrap-distance-left:0;mso-wrap-distance-top:0;mso-wrap-distance-right:0;mso-wrap-distance-bottom:0;mso-position-horizontal:absolute;mso-position-horizontal-relative:page;mso-position-vertical:absolute;mso-position-vertical-relative:text;v-text-anchor:top" coordsize="83185,748030" o:gfxdata="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" path="m42011,l26079,3154,13068,11755,4296,24511,1079,40132,3813,54578r7521,12114l22617,75470r14022,4438l36639,668007r-14410,4202l10599,680967,2829,693221,,707910r3216,15618l11988,736280r13011,8597l40932,748030r15932,-3153l69875,736280r8772,-12752l81864,707910,79225,693700,71953,681724,61016,672933,47383,668274r,-588366l61405,75470,72688,66692,80209,54578,82943,40132,79727,24511,70954,11755,57944,3154,42011,xe" fillcolor="#9ecac5" stroked="f">
+              <v:shape w14:anchorId="3D4CDFA4" id="Graphic 65" o:spid="_x0000_s1026" style="position:absolute;margin-left:294.55pt;margin-top:22.35pt;width:6.55pt;height:58.9pt;z-index:-15715840;visibility:visible;mso-wrap-style:square;mso-wrap-distance-left:0;mso-wrap-distance-top:0;mso-wrap-distance-right:0;mso-wrap-distance-bottom:0;mso-position-horizontal:absolute;mso-position-horizontal-relative:page;mso-position-vertical:absolute;mso-position-vertical-relative:text;v-text-anchor:top" coordsize="83185,748030" o:gfxdata="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" path="m42011,l26079,3154,13068,11755,4296,24511,1079,40132,3813,54578r7521,12114l22617,75470r14022,4438l36639,668007r-14410,4202l10599,680967,2829,693221,,707910r3216,15618l11988,736280r13011,8597l40932,748030r15932,-3153l69875,736280r8772,-12752l81864,707910,79225,693700,71953,681724,61016,672933,47383,668274r,-588366l61405,75470,72688,66692,80209,54578,82943,40132,79727,24511,70954,11755,57944,3154,42011,xe" fillcolor="#9ecac5" stroked="f">
                 <v:path arrowok="t"/>
                 <w10:wrap type="topAndBottom" anchorx="page"/>
               </v:shape>
@@ -27521,7 +27501,7 @@
           </mc:Choice>
           <mc:Fallback>
             <w:pict>
-              <v:group w14:anchorId="34CD19B2" id="Group 66" o:spid="_x0000_s1026" style="position:absolute;margin-left:304.7pt;margin-top:23.9pt;width:90.35pt;height:55.85pt;z-index:-15715328;mso-wrap-distance-left:0;mso-wrap-distance-right:0;mso-position-horizontal-relative:page" coordsize="11474,7092" o:gfxdata="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">
+              <v:group w14:anchorId="05D72DF1" id="Group 66" o:spid="_x0000_s1026" style="position:absolute;margin-left:304.7pt;margin-top:23.9pt;width:90.35pt;height:55.85pt;z-index:-15715328;mso-wrap-distance-left:0;mso-wrap-distance-right:0;mso-position-horizontal-relative:page" coordsize="11474,7092" o:gfxdata="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">
                 <v:shape id="Image 67" o:spid="_x0000_s1027" type="#_x0000_t75" style="position:absolute;left:5122;top:2945;width:1224;height:1201;visibility:visible;mso-wrap-style:square" o:gfxdata="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">
                   <v:imagedata r:id="rId14" o:title=""/>
                 </v:shape>
@@ -27729,7 +27709,7 @@
           </mc:Choice>
           <mc:Fallback>
             <w:pict>
-              <v:shape w14:anchorId="2B612E6B" id="Graphic 69" o:spid="_x0000_s1026" style="position:absolute;margin-left:398.65pt;margin-top:22.35pt;width:6.4pt;height:58.9pt;z-index:-15714816;visibility:visible;mso-wrap-style:square;mso-wrap-distance-left:0;mso-wrap-distance-top:0;mso-wrap-distance-right:0;mso-wrap-distance-bottom:0;mso-position-horizontal:absolute;mso-position-horizontal-relative:page;mso-position-vertical:absolute;mso-position-vertical-relative:text;v-text-anchor:top" coordsize="81280,748030" o:gfxdata="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" path="m80987,40132l77774,24523,68999,11760,55994,3162,40754,254r,-216l40233,165,39433,,38214,50r,559l25260,3517,12649,12179,4178,24790,1079,40132,3721,54343r7264,11976l21932,75107r13640,4649l35572,668134r-14033,4445l10261,681355,2730,693470,,707910r3200,15583l11925,736231r12954,8611l38214,747522r,355l38963,747674r1791,356l40754,747191r12141,-3340l64770,735114r7950,-12345l75615,707910,73164,694194,66382,682523,56134,673735,43281,668680r,-588556l58077,76161,70040,67437,78066,55054,80987,40132xe" fillcolor="#9ecac5" stroked="f">
+              <v:shape w14:anchorId="2BC79716" id="Graphic 69" o:spid="_x0000_s1026" style="position:absolute;margin-left:398.65pt;margin-top:22.35pt;width:6.4pt;height:58.9pt;z-index:-15714816;visibility:visible;mso-wrap-style:square;mso-wrap-distance-left:0;mso-wrap-distance-top:0;mso-wrap-distance-right:0;mso-wrap-distance-bottom:0;mso-position-horizontal:absolute;mso-position-horizontal-relative:page;mso-position-vertical:absolute;mso-position-vertical-relative:text;v-text-anchor:top" coordsize="81280,748030" o:gfxdata="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" path="m80987,40132l77774,24523,68999,11760,55994,3162,40754,254r,-216l40233,165,39433,,38214,50r,559l25260,3517,12649,12179,4178,24790,1079,40132,3721,54343r7264,11976l21932,75107r13640,4649l35572,668134r-14033,4445l10261,681355,2730,693470,,707910r3200,15583l11925,736231r12954,8611l38214,747522r,355l38963,747674r1791,356l40754,747191r12141,-3340l64770,735114r7950,-12345l75615,707910,73164,694194,66382,682523,56134,673735,43281,668680r,-588556l58077,76161,70040,67437,78066,55054,80987,40132xe" fillcolor="#9ecac5" stroked="f">
                 <v:path arrowok="t"/>
                 <w10:wrap type="topAndBottom" anchorx="page"/>
               </v:shape>
@@ -28694,7 +28674,7 @@
           </mc:Choice>
           <mc:Fallback>
             <w:pict>
-              <v:group w14:anchorId="5AA6E1A2" id="Group 70" o:spid="_x0000_s1026" style="position:absolute;margin-left:408.65pt;margin-top:23.9pt;width:90.35pt;height:55.85pt;z-index:-15714304;mso-wrap-distance-left:0;mso-wrap-distance-right:0;mso-position-horizontal-relative:page" coordsize="11474,7092" o:gfxdata="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">
+              <v:group w14:anchorId="0B18E403" id="Group 70" o:spid="_x0000_s1026" style="position:absolute;margin-left:408.65pt;margin-top:23.9pt;width:90.35pt;height:55.85pt;z-index:-15714304;mso-wrap-distance-left:0;mso-wrap-distance-right:0;mso-position-horizontal-relative:page" coordsize="11474,7092" o:gfxdata="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">
                 <v:shape id="Image 71" o:spid="_x0000_s1027" type="#_x0000_t75" style="position:absolute;left:5122;top:2945;width:1224;height:1201;visibility:visible;mso-wrap-style:square" o:gfxdata="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">
                   <v:imagedata r:id="rId14" o:title=""/>
                 </v:shape>
@@ -28875,7 +28855,7 @@
           </mc:Choice>
           <mc:Fallback>
             <w:pict>
-              <v:shape w14:anchorId="77F00429" id="Graphic 73" o:spid="_x0000_s1026" style="position:absolute;margin-left:502.6pt;margin-top:22.35pt;width:6.55pt;height:58.9pt;z-index:-15713792;visibility:visible;mso-wrap-style:square;mso-wrap-distance-left:0;mso-wrap-distance-top:0;mso-wrap-distance-right:0;mso-wrap-distance-bottom:0;mso-position-horizontal:absolute;mso-position-horizontal-relative:page;mso-position-vertical:absolute;mso-position-vertical-relative:text;v-text-anchor:top" coordsize="83185,748030" o:gfxdata="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" path="m42011,l26079,3154,13068,11755,4296,24511,1079,40132,3813,54578r7521,12114l22617,75470r14022,4438l36639,668007r-14410,4202l10599,680967,2829,693221,,707910r3216,15618l11988,736280r13011,8597l40932,748030r15932,-3153l69875,736280r8772,-12752l81864,707910,79225,693700,71953,681724,61016,672933,47383,668274r,-588366l61405,75470,72688,66692,80209,54578,82943,40132,79727,24511,70954,11755,57944,3154,42011,xe" fillcolor="#9ecac5" stroked="f">
+              <v:shape w14:anchorId="730CD153" id="Graphic 73" o:spid="_x0000_s1026" style="position:absolute;margin-left:502.6pt;margin-top:22.35pt;width:6.55pt;height:58.9pt;z-index:-15713792;visibility:visible;mso-wrap-style:square;mso-wrap-distance-left:0;mso-wrap-distance-top:0;mso-wrap-distance-right:0;mso-wrap-distance-bottom:0;mso-position-horizontal:absolute;mso-position-horizontal-relative:page;mso-position-vertical:absolute;mso-position-vertical-relative:text;v-text-anchor:top" coordsize="83185,748030" o:gfxdata="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" path="m42011,l26079,3154,13068,11755,4296,24511,1079,40132,3813,54578r7521,12114l22617,75470r14022,4438l36639,668007r-14410,4202l10599,680967,2829,693221,,707910r3216,15618l11988,736280r13011,8597l40932,748030r15932,-3153l69875,736280r8772,-12752l81864,707910,79225,693700,71953,681724,61016,672933,47383,668274r,-588366l61405,75470,72688,66692,80209,54578,82943,40132,79727,24511,70954,11755,57944,3154,42011,xe" fillcolor="#9ecac5" stroked="f">
                 <v:path arrowok="t"/>
                 <w10:wrap type="topAndBottom" anchorx="page"/>
               </v:shape>
@@ -29732,7 +29712,7 @@
           </mc:Choice>
           <mc:Fallback>
             <w:pict>
-              <v:group w14:anchorId="6D1D3F8F" id="Group 74" o:spid="_x0000_s1026" style="position:absolute;margin-left:512.8pt;margin-top:23.9pt;width:80.25pt;height:55.3pt;z-index:-15713280;mso-wrap-distance-left:0;mso-wrap-distance-right:0;mso-position-horizontal-relative:page" coordsize="10191,7023" o:gfxdata="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">
+              <v:group w14:anchorId="11B872D2" id="Group 74" o:spid="_x0000_s1026" style="position:absolute;margin-left:512.8pt;margin-top:23.9pt;width:80.25pt;height:55.3pt;z-index:-15713280;mso-wrap-distance-left:0;mso-wrap-distance-right:0;mso-position-horizontal-relative:page" coordsize="10191,7023" o:gfxdata="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">
                 <v:shape id="Image 75" o:spid="_x0000_s1027" type="#_x0000_t75" style="position:absolute;left:5122;top:2945;width:1224;height:1201;visibility:visible;mso-wrap-style:square" o:gfxdata="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">
                   <v:imagedata r:id="rId14" o:title=""/>
                 </v:shape>
@@ -29812,21 +29792,24 @@
       </w:pPr>
       <w:r>
         <w:rPr>
+          <w:rFonts w:ascii="Times New Roman" w:hAnsi="Times New Roman" w:cs="Times New Roman"/>
           <w:noProof/>
+          <w:sz w:val="24"/>
+          <w:szCs w:val="24"/>
         </w:rPr>
         <w:drawing>
-          <wp:anchor distT="0" distB="0" distL="0" distR="0" simplePos="0" relativeHeight="487603712" behindDoc="1" locked="0" layoutInCell="1" allowOverlap="1" wp14:anchorId="49B53E6A" wp14:editId="4928542E">
+          <wp:anchor distT="0" distB="0" distL="114300" distR="114300" simplePos="0" relativeHeight="487605248" behindDoc="0" locked="0" layoutInCell="1" allowOverlap="1" wp14:anchorId="5D93890E" wp14:editId="656C99CC">
             <wp:simplePos x="0" y="0"/>
-            <wp:positionH relativeFrom="page">
-              <wp:posOffset>2382247</wp:posOffset>
+            <wp:positionH relativeFrom="column">
+              <wp:posOffset>2330443</wp:posOffset>
             </wp:positionH>
             <wp:positionV relativeFrom="paragraph">
-              <wp:posOffset>264120</wp:posOffset>
+              <wp:posOffset>297180</wp:posOffset>
             </wp:positionV>
-            <wp:extent cx="1528487" cy="638175"/>
-            <wp:effectExtent l="0" t="0" r="0" b="0"/>
-            <wp:wrapTopAndBottom/>
-            <wp:docPr id="77" name="Image 77"/>
+            <wp:extent cx="1536700" cy="622300"/>
+            <wp:effectExtent l="0" t="0" r="6350" b="6350"/>
+            <wp:wrapNone/>
+            <wp:docPr id="797" name="Afbeelding 1"/>
             <wp:cNvGraphicFramePr>
               <a:graphicFrameLocks xmlns:a="http://schemas.openxmlformats.org/drawingml/2006/main"/>
             </wp:cNvGraphicFramePr>
@@ -29834,23 +29817,36 @@
               <a:graphicData uri="http://schemas.openxmlformats.org/drawingml/2006/picture">
                 <pic:pic xmlns:pic="http://schemas.openxmlformats.org/drawingml/2006/picture">
                   <pic:nvPicPr>
-                    <pic:cNvPr id="77" name="Image 77"/>
-                    <pic:cNvPicPr/>
+                    <pic:cNvPr id="0" name="Picture 797"/>
+                    <pic:cNvPicPr>
+                      <a:picLocks/>
+                    </pic:cNvPicPr>
                   </pic:nvPicPr>
                   <pic:blipFill>
-                    <a:blip r:embed="rId17" cstate="print"/>
+                    <a:blip r:embed="rId17" cstate="print">
+                      <a:extLst>
+                        <a:ext uri="{28A0092B-C50C-407E-A947-70E740481C1C}">
+                          <a14:useLocalDpi xmlns:a14="http://schemas.microsoft.com/office/drawing/2010/main" val="0"/>
+                        </a:ext>
+                      </a:extLst>
+                    </a:blip>
+                    <a:srcRect/>
                     <a:stretch>
                       <a:fillRect/>
                     </a:stretch>
                   </pic:blipFill>
-                  <pic:spPr>
+                  <pic:spPr bwMode="auto">
                     <a:xfrm>
                       <a:off x="0" y="0"/>
-                      <a:ext cx="1528487" cy="638175"/>
+                      <a:ext cx="1536700" cy="622300"/>
                     </a:xfrm>
                     <a:prstGeom prst="rect">
                       <a:avLst/>
                     </a:prstGeom>
+                    <a:noFill/>
+                    <a:ln>
+                      <a:noFill/>
+                    </a:ln>
                   </pic:spPr>
                 </pic:pic>
               </a:graphicData>
@@ -29865,7 +29861,7 @@
         <mc:AlternateContent>
           <mc:Choice Requires="wpg">
             <w:drawing>
-              <wp:anchor distT="0" distB="0" distL="0" distR="0" simplePos="0" relativeHeight="487604224" behindDoc="1" locked="0" layoutInCell="1" allowOverlap="1" wp14:anchorId="2B32433A" wp14:editId="4249CBBB">
+              <wp:anchor distT="0" distB="0" distL="0" distR="0" simplePos="0" relativeHeight="487604224" behindDoc="1" locked="0" layoutInCell="1" allowOverlap="1" wp14:anchorId="2B32433A" wp14:editId="00E42966">
                 <wp:simplePos x="0" y="0"/>
                 <wp:positionH relativeFrom="page">
                   <wp:posOffset>4846701</wp:posOffset>
@@ -32599,7 +32595,7 @@
           </mc:Choice>
           <mc:Fallback>
             <w:pict>
-              <v:group w14:anchorId="2387A521" id="Group 78" o:spid="_x0000_s1026" style="position:absolute;margin-left:381.65pt;margin-top:21.25pt;width:49.65pt;height:49.65pt;z-index:-15712256;mso-wrap-distance-left:0;mso-wrap-distance-right:0;mso-position-horizontal-relative:page" coordsize="6305,6305" o:gfxdata="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">
+              <v:group w14:anchorId="37B4BF8C" id="Group 78" o:spid="_x0000_s1026" style="position:absolute;margin-left:381.65pt;margin-top:21.25pt;width:49.65pt;height:49.65pt;z-index:-15712256;mso-wrap-distance-left:0;mso-wrap-distance-right:0;mso-position-horizontal-relative:page" coordsize="6305,6305" o:gfxdata="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">
                 <v:shape id="Graphic 79" o:spid="_x0000_s1027" style="position:absolute;width:2273;height:6305;visibility:visible;mso-wrap-style:square;v-text-anchor:top" coordsize="227329,630555" o:gfxdata="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" path="m25196,453605l,453605r,50394l,579602r,50394l25196,629996r,-50394l25196,503999r,-50394xem25196,378002l,378002r,25197l25196,403199r,-25197xem25196,252006l,252006r,25196l,327609r25196,l25196,277202r,-25196xem25196,201599l,201599r,25197l25196,226796r,-25197xem25196,151206l,151206r,25197l25196,176403r,-25197xem25196,l,,,151193r25196,l25196,xem75590,604799r-25184,l25209,604799r,25197l50406,629996r25184,l75590,604799xem75590,503999r-25184,l50406,579602r25184,l75590,503999xem75590,453605r-25184,l25209,453605r,25197l50406,478802r25184,l75590,453605xem75590,403199r-25184,l50406,428396r25184,l75590,403199xem75590,252006r-25184,l50406,226809r-25197,l25209,277202r,100800l50406,378002r,-100800l75590,277202r,-25196xem75590,201599r-25184,l50406,226796r25184,l75590,201599xem75590,151206r-25184,l25209,151206r,25197l50406,176403r25184,l75590,151206xem75590,50406r-25184,l50406,126009r25184,l75590,50406xem75590,l50406,,25209,r,25196l50406,25196r25184,l75590,xem100799,327609r-25196,l75603,378002r25196,l100799,327609xem100799,201599r-25196,l75603,226796r25196,l100799,201599xem125996,604799r-25197,l75603,604799r,25197l100799,629996r25197,l125996,604799xem125996,503999r-25197,l75603,503999r,75603l100799,579602r25197,l125996,503999xem125996,453605r-25197,l75603,453605r,25197l100799,478802r25197,l125996,453605xem125996,403199r-25197,l75603,403199r,25197l100799,428396r25197,l125996,403199xem125996,226809r-25197,l100799,252006r-25196,l75603,277202r25196,l100799,302399r25197,l125996,277202r,-50393xem125996,151206r-25197,l75603,151206r,25197l100799,176403r25197,l125996,151206xem125996,50406r-25197,l75603,50406r,75603l100799,126009r25197,l125996,50406xem125996,l100799,,75603,r,25196l100799,25196r25197,l125996,xem176403,453605r-25197,l126009,453605r,25197l151206,478802r,25197l151206,579602r,25197l126009,604799r,25197l151206,629996r25197,l176403,579602r,-75603l176403,453605xem176403,403199r-25197,l151206,378002r-25197,l126009,428396r25197,l176403,428396r,-25197xem176403,151206r-25197,l126009,151206r,25197l151206,176403r25197,l176403,151206xem176403,l151206,,126009,r,25196l151206,25196r,125997l176403,151193,176403,xem201587,252006r-25184,l151206,252006r-25197,l126009,277202r25197,l176403,277202r,25197l151206,302399r-25197,l126009,327596r25197,l176403,327596r,25210l151206,352806r,25196l176403,378002r25184,l201587,277202r,-25196xem201587,201599r-25184,l151206,201599r-25197,l126009,226796r25197,l176403,226796r25184,l201587,201599xem226796,428409r-25197,l201599,504024r25197,l226796,428409xem226796,352806r-25197,l201599,403199r25197,l226796,352806xem226796,252006r-25197,l201599,277202r,50407l226796,327609r,-50407l226796,252006xem226796,151206r-25197,l201599,201599r25197,l226796,151206xem226796,75603r-25197,l201599,100799r25197,l226796,75603xem226796,l201599,r,50406l226796,50406,226796,xe" fillcolor="#31305a" stroked="f">
                   <v:path arrowok="t"/>
                 </v:shape>

</xml_diff>